<commit_message>
docs/onderzoek: Coene 2026a herclassificeerd als interne notitie ORM
Verspreiding-omschrijving aangepast op drie plekken:
- bronnen-werkbestand.md: status-regel
- H16 referenties: APA-entry met [interne notitie] en 'breed gedeeld
  binnen de opleiding'
- H17 bijlagen G2: tabel-rij en sectie-titel naar 'Interne notitie
  AI in het hoger onderwijs'

Eerder stond 'intern document, breed gedeeld binnen Hanze + één keer
extern verspreid'. Correctie van Lex: het is een interne notitie van
de opleiding ORM, breed gedeeld binnen de opleiding (niet Hanze-breed).

Word-versies regenereerd voor H16, H17 en samengevoegd rapport-v0.2.

Co-Authored-By: Claude Opus 4.7 (1M context) <noreply@anthropic.com>
</commit_message>
<xml_diff>
--- a/docs/onderzoek/word/hoofdstuk-16-referenties.docx
+++ b/docs/onderzoek/word/hoofdstuk-16-referenties.docx
@@ -367,7 +367,10 @@
         <w:t xml:space="preserve">AI in het hoger onderwijs: Kansen, risico’s en didactische randvoorwaarden</w:t>
       </w:r>
       <w:r>
-        <w:t xml:space="preserve">. Hanzehogeschool Groningen, opleiding ORM (intern document, breed gedeeld binnen Hanze + één keer extern verspreid).</w:t>
+        <w:t xml:space="preserve"> </w:t>
+      </w:r>
+      <w:r>
+        <w:t xml:space="preserve">[interne notitie]. Hanzehogeschool Groningen, opleiding ORM (breed gedeeld binnen de opleiding).</w:t>
       </w:r>
     </w:p>
     <w:p>

</xml_diff>